<commit_message>
Actualizar descarga del Word incrustado con la Sección 9 de Bibliografía completa
</commit_message>
<xml_diff>
--- a/informe_situacion_salud_tres_de_febrero_ACTUALIZADO.docx
+++ b/informe_situacion_salud_tres_de_febrero_ACTUALIZADO.docx
@@ -2208,6 +2208,226 @@
         <w:t>📌 Fuente y Referencia: Plan Estratégico de Salud Distrital 2026–2027 y Acuerdos Marco de Gobernanza Sanitaria Intergubernamental para la Región Sanitaria VII (Ministerio de Salud de la Provincia de Buenos Aires y Secretaría de Salud de Tres de Febrero).</w:t>
       </w:r>
     </w:p>
+    <w:p>
+      <w:pPr>
+        <w:spacing w:before="360" w:after="160"/>
+      </w:pPr>
+      <w:r>
+        <w:rPr>
+          <w:b/>
+          <w:color w:val="1E3A8A"/>
+          <w:sz w:val="30"/>
+        </w:rPr>
+        <w:t>9. Bibliografía y Fuentes Oficiales de Información (Enlaces de Acceso Directo)</w:t>
+      </w:r>
+    </w:p>
+    <w:p>
+      <w:pPr>
+        <w:spacing w:after="120" w:line="276" w:lineRule="auto"/>
+      </w:pPr>
+      <w:r>
+        <w:rPr>
+          <w:b/>
+          <w:color w:val="0F172A"/>
+        </w:rPr>
+        <w:t xml:space="preserve">Fuentes y Enlaces Institucionales: </w:t>
+      </w:r>
+      <w:r>
+        <w:t>El presente Análisis de Situación de Salud (ASIS) del Partido de Tres de Febrero ha sido elaborado bajo estándares metodológicos rigurosos, consolidando bases de datos primarias y secundarias de organismos estadísticos y sanitarios de jerarquía nacional, provincial y municipal. A continuación, se detallan las referencias bibliográficas oficiales y los enlaces de acceso web directo para la consulta pública y auditoría de la información:</w:t>
+      </w:r>
+    </w:p>
+    <w:p>
+      <w:pPr>
+        <w:spacing w:after="160" w:line="276" w:lineRule="auto"/>
+      </w:pPr>
+      <w:r>
+        <w:rPr>
+          <w:rFonts w:ascii="Calibri" w:hAnsi="Calibri"/>
+          <w:b/>
+          <w:color w:val="163C68"/>
+          <w:sz w:val="22"/>
+        </w:rPr>
+        <w:t xml:space="preserve">• INDEC — Censo Nacional de Población, Hogares y Viviendas 2022: </w:t>
+      </w:r>
+      <w:r>
+        <w:rPr>
+          <w:rFonts w:ascii="Calibri" w:hAnsi="Calibri"/>
+          <w:color w:val="333333"/>
+          <w:sz w:val="21"/>
+        </w:rPr>
+        <w:t>Instituto Nacional de Estadística y Censos (INDEC). Resultados definitivos del Censo 2022: Indicadores demográficos por sexo, grupos de edad, fecundidad y características estructurales de las viviendas particulares para el Partido de Tres de Febrero (Código 06840).</w:t>
+        <w:br/>
+        <w:t>Enlace de acceso directo: https://www.indec.gob.ar/indec/web/Nivel4-Tema-2-41-165</w:t>
+      </w:r>
+    </w:p>
+    <w:p>
+      <w:pPr>
+        <w:spacing w:after="160" w:line="276" w:lineRule="auto"/>
+      </w:pPr>
+      <w:r>
+        <w:rPr>
+          <w:rFonts w:ascii="Calibri" w:hAnsi="Calibri"/>
+          <w:b/>
+          <w:color w:val="163C68"/>
+          <w:sz w:val="22"/>
+        </w:rPr>
+        <w:t xml:space="preserve">• INDEC — Geoportal y Cartografía Georreferenciada por Radios Censales: </w:t>
+      </w:r>
+      <w:r>
+        <w:rPr>
+          <w:rFonts w:ascii="Calibri" w:hAnsi="Calibri"/>
+          <w:color w:val="333333"/>
+          <w:sz w:val="21"/>
+        </w:rPr>
+        <w:t>Base cartográfica poligonal oficial y cobertura sanitaria por radios censales e intervalos espaciales. Sistema de Consulta Georreferenciada INDEC.</w:t>
+        <w:br/>
+        <w:t>Enlace de acceso directo: https://geoah.indec.gob.ar/ y https://www.indec.gob.ar/indec/web/Institucional-Indec-Censo2022-MarcoEstadistico</w:t>
+      </w:r>
+    </w:p>
+    <w:p>
+      <w:pPr>
+        <w:spacing w:after="160" w:line="276" w:lineRule="auto"/>
+      </w:pPr>
+      <w:r>
+        <w:rPr>
+          <w:rFonts w:ascii="Calibri" w:hAnsi="Calibri"/>
+          <w:b/>
+          <w:color w:val="163C68"/>
+          <w:sz w:val="22"/>
+        </w:rPr>
+        <w:t xml:space="preserve">• SISA / REFES — Registro Federal de Establecimientos de Salud: </w:t>
+      </w:r>
+      <w:r>
+        <w:rPr>
+          <w:rFonts w:ascii="Calibri" w:hAnsi="Calibri"/>
+          <w:color w:val="333333"/>
+          <w:sz w:val="21"/>
+        </w:rPr>
+        <w:t>Ministerio de Salud de la Nación. Sistema Integrado de Información Sanitaria Argentino (SISA) y Catálogo Nacional de Establecimientos de Salud (REFES). Georreferenciación, tipología prestacional y dependencia de hospitales provinciales, nacionales y los 13 CAPS municipales de Tres de Febrero.</w:t>
+        <w:br/>
+        <w:t>Enlace de acceso directo: https://sisa.msal.gov.ar/sisa/#sika</w:t>
+      </w:r>
+    </w:p>
+    <w:p>
+      <w:pPr>
+        <w:spacing w:after="160" w:line="276" w:lineRule="auto"/>
+      </w:pPr>
+      <w:r>
+        <w:rPr>
+          <w:rFonts w:ascii="Calibri" w:hAnsi="Calibri"/>
+          <w:b/>
+          <w:color w:val="163C68"/>
+          <w:sz w:val="22"/>
+        </w:rPr>
+        <w:t xml:space="preserve">• Ministerio de Salud PBA — Región Sanitaria VII: </w:t>
+      </w:r>
+      <w:r>
+        <w:rPr>
+          <w:rFonts w:ascii="Calibri" w:hAnsi="Calibri"/>
+          <w:color w:val="333333"/>
+          <w:sz w:val="21"/>
+        </w:rPr>
+        <w:t>Dirección Provincial de Hospitales y Coordinación de la Región Sanitaria VII (Morón, Tres de Febrero, Hurlingham, Ituzaingó, Merlo, Moreno, Gral. Las Heras, Gral. Rodríguez, Luján y Marcos Paz). Informes epidemiológicos y red de emergencias SIES.</w:t>
+        <w:br/>
+        <w:t>Enlace de acceso directo: https://www.ms.gba.gov.ar/sitios/regiones-sanitarias/ y https://www.ms.gba.gov.ar/sitios/hospitales/</w:t>
+      </w:r>
+    </w:p>
+    <w:p>
+      <w:pPr>
+        <w:spacing w:after="160" w:line="276" w:lineRule="auto"/>
+      </w:pPr>
+      <w:r>
+        <w:rPr>
+          <w:rFonts w:ascii="Calibri" w:hAnsi="Calibri"/>
+          <w:b/>
+          <w:color w:val="163C68"/>
+          <w:sz w:val="22"/>
+        </w:rPr>
+        <w:t xml:space="preserve">• DEIS — Dirección de Estadísticas e Información en Salud: </w:t>
+      </w:r>
+      <w:r>
+        <w:rPr>
+          <w:rFonts w:ascii="Calibri" w:hAnsi="Calibri"/>
+          <w:color w:val="333333"/>
+          <w:sz w:val="21"/>
+        </w:rPr>
+        <w:t>Ministerio de Salud de la Nación. Estadísticas vitales, mortalidad infantil, materna y por causas en el Conurbano Bonaerense y Región Sanitaria VII.</w:t>
+        <w:br/>
+        <w:t>Enlace de acceso directo: https://deis.msal.gov.ar/</w:t>
+      </w:r>
+    </w:p>
+    <w:p>
+      <w:pPr>
+        <w:spacing w:after="160" w:line="276" w:lineRule="auto"/>
+      </w:pPr>
+      <w:r>
+        <w:rPr>
+          <w:rFonts w:ascii="Calibri" w:hAnsi="Calibri"/>
+          <w:b/>
+          <w:color w:val="163C68"/>
+          <w:sz w:val="22"/>
+        </w:rPr>
+        <w:t xml:space="preserve">• Secretaría de Salud y Gestión Operativa — Municipalidad de Tres de Febrero: </w:t>
+      </w:r>
+      <w:r>
+        <w:rPr>
+          <w:rFonts w:ascii="Calibri" w:hAnsi="Calibri"/>
+          <w:color w:val="333333"/>
+          <w:sz w:val="21"/>
+        </w:rPr>
+        <w:t>Portal de Gobierno Municipal, red de Centros de Atención Primaria de la Salud (CAPS 1 al 13), CEMAR y Hospital Odontológico y Oftalmológico Di Próspero. Programas de salud territorial y turnero municipal.</w:t>
+        <w:br/>
+        <w:t>Enlace de acceso directo: https://www.tresdefebrero.gov.ar/salud/</w:t>
+      </w:r>
+    </w:p>
+    <w:p>
+      <w:pPr>
+        <w:spacing w:after="160" w:line="276" w:lineRule="auto"/>
+      </w:pPr>
+      <w:r>
+        <w:rPr>
+          <w:rFonts w:ascii="Calibri" w:hAnsi="Calibri"/>
+          <w:b/>
+          <w:color w:val="163C68"/>
+          <w:sz w:val="22"/>
+        </w:rPr>
+        <w:t xml:space="preserve">• PAMI — Instituto Nacional de Servicios Sociales para Jubilados y Pensionados: </w:t>
+      </w:r>
+      <w:r>
+        <w:rPr>
+          <w:rFonts w:ascii="Calibri" w:hAnsi="Calibri"/>
+          <w:color w:val="333333"/>
+          <w:sz w:val="21"/>
+        </w:rPr>
+        <w:t>Estadísticas de cobertura prestacional gerontológica, cápitas asignadas por clínica/hospital e interconsultas especializadas para adultos mayores (≥65 años).</w:t>
+        <w:br/>
+        <w:t>Enlace de acceso directo: https://www.pami.org.ar/ y https://estadisticas.pami.org.ar/</w:t>
+      </w:r>
+    </w:p>
+    <w:p>
+      <w:pPr>
+        <w:spacing w:after="160" w:line="276" w:lineRule="auto"/>
+      </w:pPr>
+      <w:r>
+        <w:rPr>
+          <w:rFonts w:ascii="Calibri" w:hAnsi="Calibri"/>
+          <w:b/>
+          <w:color w:val="163C68"/>
+          <w:sz w:val="22"/>
+        </w:rPr>
+        <w:t xml:space="preserve">• OpenStreetMap Nominatim — Geocodificación Geoespacial Verificada: </w:t>
+      </w:r>
+      <w:r>
+        <w:rPr>
+          <w:rFonts w:ascii="Calibri" w:hAnsi="Calibri"/>
+          <w:color w:val="333333"/>
+          <w:sz w:val="21"/>
+        </w:rPr>
+        <w:t>Base de datos cartográfica global para verificación de coordenadas exactas y parcelas catastrales de establecimientos de salud en el Corredor Norte, Centro y Sur de Tres de Febrero.</w:t>
+        <w:br/>
+        <w:t>Enlace de acceso directo: https://nominatim.openstreetmap.org/</w:t>
+      </w:r>
+    </w:p>
     <w:sectPr>
       <w:pgSz w:w="12240" w:h="15840"/>
       <w:pgMar w:top="1440" w:right="1584" w:bottom="1440" w:left="1584" w:header="720" w:footer="720" w:gutter="0"/>

</xml_diff>